<commit_message>
Update final deliverables with re-simulated KPIs (21/672/4.2).
Align report, manual, and presentation with 18,000s results and add FINAL_CONFIRMATION cross-check vs problem PDF.

Co-authored-by: Cursor <cursoragent@cursor.com>
</commit_message>
<xml_diff>
--- a/제23회한국대학생컴퓨터시뮬레이션경진대회_인하이트보고서.docx
+++ b/제23회한국대학생컴퓨터시뮬레이션경진대회_인하이트보고서.docx
@@ -819,7 +819,7 @@
           <w:szCs w:val="24"/>
           <w:lang w:eastAsia="ko-KR"/>
         </w:rPr>
-        <w:t>S/A 박스를 제함기1·2의 실시간 대기열 크기를 비교하여 동적 분배함으로써 제함기1 부하를 75% → 약 37.5%로 절감한다.</w:t>
+        <w:t>S/A 박스를 제함기1·2의 실시간 대기열 크기를 비교하여 동적 분배함으로써 제함기1 부하를 실측 기준 포화(약 100%)에서 약 30%로 낮추고 제함기2의 유휴 용량을 활용하도록 재분배한다.</w:t>
       </w:r>
     </w:p>
     <w:p>
@@ -4972,7 +4972,7 @@
           <w:szCs w:val="24"/>
           <w:lang w:eastAsia="ko-KR"/>
         </w:rPr>
-        <w:t>즉, 전체 8,858 박스의 약 75%인 6,644 박스가 AGV를 통한 S/A급 피킹 대상이며, 나머지 25%(2,214 박스)는 B/C급 전용으로 컨베이어로만 처리된다.</w:t>
+        <w:t>SKU 독립 확률에 근거한 이론값은 P(S∪A)=75%이나, 실제 주문 DB에서는 8,858 박스 중 91.7%인 8,120 박스가 S/A급을 포함하여 AGV 피킹 대상이며, 나머지 8.3%(738 박스)만 B/C급 전용으로 컨베이어로 처리된다. 본 시뮬레이션은 이론값이 아닌 실제 주문 DB를 입력으로 사용한다.</w:t>
       </w:r>
     </w:p>
     <w:p>
@@ -5111,7 +5111,7 @@
           <w:szCs w:val="24"/>
           <w:lang w:eastAsia="ko-KR"/>
         </w:rPr>
-        <w:t>이 로직은 S급 또는 A급이 포함된 모든 박스(약 75%)를 제함기1 단독으로 처리하도록 설계되어 있다. 제함기2는 조건이 False인 경우에만 사용되는데, False가 되려면 S급과 A급이 동시에 없는 경우(25%)여야 한다. 그런데 제함기3은 B/C급 전용이므로, 실질적으로 제함기1이 전체 박스의 75%를, 제함기2가 0%를 처리하는 극심한 불균형이 발생한다.</w:t>
+        <w:t>이 로직은 S급 또는 A급이 포함된 모든 박스(이론 75% · 실제 DB 91.7%)를 제함기1 단독으로 처리하도록 설계되어 있다. 제함기2는 조건이 False인 경우에만 사용되는데, False가 되려면 S급과 A급이 동시에 없는 경우(25%)여야 한다. 그런데 제함기3은 B/C급 전용이므로, 실질적으로 제함기1이 전체 박스의 75%를, 제함기2가 0%를 처리하는 극심한 불균형이 발생한다.</w:t>
       </w:r>
     </w:p>
     <w:p>
@@ -5384,7 +5384,7 @@
                 <w:rFonts w:eastAsia="맑은 고딕"/>
                 <w:szCs w:val="24"/>
               </w:rPr>
-              <w:t>S/A 박스 75% 단독 처리</w:t>
+              <w:t>S/A 박스 91.7% (DB) · 이론 75% 단독 처리</w:t>
             </w:r>
           </w:p>
         </w:tc>
@@ -5535,7 +5535,7 @@
                 <w:szCs w:val="24"/>
                 <w:lang w:eastAsia="ko-KR"/>
               </w:rPr>
-              <w:t>정적 슬롯 배정으로 유휴 슬롯 발생</w:t>
+              <w:t>기본 슬롯 로직(selectOutput6) · TO-BE 동적 배정 강화으로 유휴 슬롯 발생</w:t>
             </w:r>
           </w:p>
         </w:tc>
@@ -7315,7 +7315,7 @@
           <w:szCs w:val="24"/>
           <w:lang w:eastAsia="ko-KR"/>
         </w:rPr>
-        <w:t>이론적으로 S/A 박스 6,644개를 제함기1과 2가 각 약 3,322개씩 균등 처리하게 되므로, 제함기 단의 병목이 해소된다. 제함기 1대 기준 처리 시간이 절반으로 감소하여 AGV 공급 속도가 2배 향상되고, 이는 하류 공정(피킹 → 봉함 → 파렛타이징) 전반의 처리량 증가로 이어진다.</w:t>
+        <w:t>실제 주문 DB 기준 S/A 박스 8,120개(91.7%)를 제함기1과 2가 각 약 4,060개씩 균등 처리하게 되므로, 제함기 단의 병목이 해소된다. 제함기 1대 기준 처리 시간이 절반으로 감소하여 AGV 공급 속도가 향상되고, 이는 하류 공정(피킹 → 봉함 → 파렛타이징) 전반의 처리량 증가로 이어진다.</w:t>
       </w:r>
     </w:p>
     <w:p>
@@ -7491,7 +7491,7 @@
           <w:szCs w:val="24"/>
           <w:lang w:eastAsia="ko-KR"/>
         </w:rPr>
-        <w:t>AS-IS에서는 AGV 배차 시 별도의 우선순위 조건이 없어 먼 거리의 AGV가 배차되는 경우가 빈번하게 발생하였다. TO-BE에서는 TransportTo 블록의 TransporterRating 파라미터에 다음 수식을 추가하여 가장 가까운 AGV를 우선 배차하도록 변경하였다.</w:t>
+        <w:t>AS-IS에서는 AGV 배차 시 별도의 우선순위 조건이 없어 먼 거리의 AGV가 배차되는 경우가 빈번하게 발생하였다. TO-BE에서는 MoveByTransporter 블록의 TransporterRating 파라미터에 다음 수식을 추가하여 가장 가까운 AGV를 우선 배차하도록 변경하였다.</w:t>
       </w:r>
     </w:p>
     <w:p>
@@ -7520,7 +7520,7 @@
           <w:szCs w:val="24"/>
           <w:lang w:eastAsia="ko-KR"/>
         </w:rPr>
-        <w:t>배차 우선순위 수식:  −transporter.distanceTo(agent)</w:t>
+        <w:t>배차 우선순위 수식:  −unit.distanceTo(agent)</w:t>
       </w:r>
     </w:p>
     <w:p>
@@ -7548,7 +7548,7 @@
           <w:szCs w:val="24"/>
           <w:lang w:eastAsia="ko-KR"/>
         </w:rPr>
-        <w:t>음수 부호는 거리가 작을수록 Rating 값이 높아지므로 가장 가까운 AGV가 선택됨을 의미한다. 이 로직은 제함기1·2에서 박스를 받는 2개 블록과, S/A 피킹 완료 후 박스 투입구로 이동하는 1개 블록, 총 3개의 이동 블록에 적용하였다.</w:t>
+        <w:t>음수 부호는 거리가 작을수록 Rating 값이 높아지므로 가장 가까운 AGV가 선택됨을 의미한다. 이 로직은 제함기1·2에서 박스를 받는 2개 블록과, S/A 피킹 완료 후 박스 투입구로 이동하는 1개 블록, 총 5개의 MoveByTransporter 블록에 적용하였다.</w:t>
       </w:r>
     </w:p>
     <w:p>
@@ -7782,7 +7782,7 @@
           <w:szCs w:val="24"/>
           <w:lang w:eastAsia="ko-KR"/>
         </w:rPr>
-        <w:t>파렛타이저 슬롯 배정 시 지점별 잔여 박스 수(branchRemainingTotal)를 실시간으로 추적하여 잔여량이 적은 지점을 우선적으로 슬롯에 배정하는 로직을 적용하였다. 이를 통해 박스 수가 적은 지점(주로 Type C)이 신속하게 처리·완료되어 슬롯이 조기 반환되고, 새로운 지점을 빠르게 투입하는 사이클이 가능해진다.</w:t>
+        <w:t>selectOutput6/7 슬롯 배정 시 지점별 잔여 박스 수(branchRemainingTotal)를 실시간으로 추적하여 잔여량이 적은 지점을 우선적으로 슬롯에 배정하는 로직을 적용하였다. 이를 통해 박스 수가 적은 지점(주로 Type C)이 신속하게 처리·완료되어 슬롯이 조기 반환되고, 새로운 지점을 빠르게 투입하는 사이클이 가능해진다.</w:t>
       </w:r>
     </w:p>
     <w:p>
@@ -9202,7 +9202,7 @@
                 <w:szCs w:val="24"/>
                 <w:lang w:eastAsia="ko-KR"/>
               </w:rPr>
-              <w:t>20 팔레트 (640 박스)</w:t>
+              <w:t>21 팔레트 (672 박스)</w:t>
             </w:r>
           </w:p>
         </w:tc>
@@ -9367,7 +9367,7 @@
                 <w:szCs w:val="24"/>
                 <w:lang w:eastAsia="ko-KR"/>
               </w:rPr>
-              <w:t>4.0</w:t>
+              <w:t>4.2</w:t>
             </w:r>
             <w:r>
               <w:rPr>
@@ -9449,7 +9449,7 @@
                 <w:szCs w:val="24"/>
                 <w:lang w:eastAsia="ko-KR"/>
               </w:rPr>
-              <w:t>약 94%</w:t>
+              <w:t>약 30%</w:t>
             </w:r>
           </w:p>
         </w:tc>
@@ -9522,7 +9522,7 @@
                 <w:szCs w:val="24"/>
                 <w:lang w:eastAsia="ko-KR"/>
               </w:rPr>
-              <w:t>약16%</w:t>
+              <w:t>약 70%</w:t>
             </w:r>
           </w:p>
         </w:tc>
@@ -9675,7 +9675,7 @@
                 <w:szCs w:val="24"/>
                 <w:lang w:eastAsia="ko-KR"/>
               </w:rPr>
-              <w:t>약 44%</w:t>
+              <w:t>약 50%</w:t>
             </w:r>
           </w:p>
         </w:tc>
@@ -10382,7 +10382,7 @@
                 <w:szCs w:val="24"/>
                 <w:lang w:eastAsia="ko-KR"/>
               </w:rPr>
-              <w:t>20 팔레트</w:t>
+              <w:t>21 팔레트</w:t>
             </w:r>
           </w:p>
         </w:tc>
@@ -10406,7 +10406,7 @@
                 <w:szCs w:val="24"/>
                 <w:lang w:eastAsia="ko-KR"/>
               </w:rPr>
-              <w:t>4.0/hr</w:t>
+              <w:t>4.2/hr</w:t>
             </w:r>
           </w:p>
         </w:tc>
@@ -10430,7 +10430,7 @@
                 <w:szCs w:val="24"/>
                 <w:lang w:eastAsia="ko-KR"/>
               </w:rPr>
-              <w:t>약 44%</w:t>
+              <w:t>약 50%</w:t>
             </w:r>
           </w:p>
         </w:tc>
@@ -10764,7 +10764,7 @@
           <w:szCs w:val="24"/>
           <w:lang w:eastAsia="ko-KR"/>
         </w:rPr>
-        <w:t>핵심 병목은 S/A 박스(75%)를 제함기1 단독으로 처리하도록 설계된 라우팅 로직에서 비롯되었다. TO-BE 모델은 제함기 동적 부하 분산, AGV 최근접 배차 및 대수 최적화, 파렛타이저 슬롯 동적 배정의 세 가지 개선을 통해 병목을 해소하고 작업 완료 시간을 유의미하게 단축하였다.</w:t>
+        <w:t>핵심 병목은 S/A 박스(이론 75% · 실제 DB 91.7%)를 제함기1 단독으로 처리하도록 설계된 라우팅 로직에서 비롯되었다. TO-BE 모델은 제함기 동적 부하 분산, AGV 최근접 배차 및 대수 최적화, 파렛타이저 슬롯 동적 배정의 세 가지 개선을 통해 병목을 해소하고 작업 완료 시간을 유의미하게 단축하였다.</w:t>
       </w:r>
     </w:p>
     <w:p>

</xml_diff>